<commit_message>
Stage bij JS Trade Agency (Castellón) toevoegen aan cv
Co-Authored-By: Claude Fable 5.1 <noreply@anthropic.com>
Claude-Session: https://claude.ai/code/session_018ykMZ2P3WGh7UyoGvnCSVu
</commit_message>
<xml_diff>
--- a/docs/cv/cv-tim-hendriks-en.docx
+++ b/docs/cv/cv-tim-hendriks-en.docx
@@ -1297,6 +1297,218 @@
                       <w:szCs w:val="19"/>
                     </w:rPr>
                     <w:t xml:space="preserve">Picking, packing and preparing orders for shipment; working accurately and keeping pace during peak periods.</w:t>
+                  </w:r>
+                </w:p>
+              </w:tc>
+            </w:tr>
+          </w:tbl>
+          <w:p>
+            <w:pPr>
+              <w:spacing w:after="0" w:line="160"/>
+            </w:pPr>
+            <w:r>
+              <w:rPr>
+                <w:rFonts w:ascii="Calibri" w:cs="Calibri" w:eastAsia="Calibri" w:hAnsi="Calibri"/>
+                <w:color w:val="262626"/>
+                <w:sz w:val="8"/>
+                <w:szCs w:val="8"/>
+              </w:rPr>
+              <w:t xml:space="preserve"/>
+            </w:r>
+          </w:p>
+          <w:tbl>
+            <w:tblPr>
+              <w:tblW w:type="dxa" w:w="6886"/>
+              <w:tblBorders>
+                <w:top w:val="none" w:color="FFFFFF" w:sz="0"/>
+                <w:left w:val="none" w:color="FFFFFF" w:sz="0"/>
+                <w:bottom w:val="none" w:color="FFFFFF" w:sz="0"/>
+                <w:right w:val="none" w:color="FFFFFF" w:sz="0"/>
+                <w:insideH w:val="single" w:color="auto" w:sz="4"/>
+                <w:insideV w:val="single" w:color="auto" w:sz="4"/>
+              </w:tblBorders>
+            </w:tblPr>
+            <w:tblGrid>
+              <w:gridCol w:w="760"/>
+              <w:gridCol w:w="6126"/>
+            </w:tblGrid>
+            <w:tr>
+              <w:trPr>
+                <w:cantSplit/>
+              </w:trPr>
+              <w:tc>
+                <w:tcPr>
+                  <w:tcW w:type="dxa" w:w="760"/>
+                  <w:tcBorders>
+                    <w:top w:val="none" w:color="FFFFFF" w:sz="0"/>
+                    <w:left w:val="none" w:color="FFFFFF" w:sz="0"/>
+                    <w:bottom w:val="none" w:color="FFFFFF" w:sz="0"/>
+                    <w:right w:val="none" w:color="FFFFFF" w:sz="0"/>
+                  </w:tcBorders>
+                  <w:shd w:fill="B5462D" w:color="auto" w:val="clear"/>
+                  <w:tcMar>
+                    <w:top w:type="dxa" w:w="80"/>
+                    <w:left w:type="dxa" w:w="40"/>
+                    <w:bottom w:type="dxa" w:w="80"/>
+                    <w:right w:type="dxa" w:w="40"/>
+                  </w:tcMar>
+                  <w:vAlign w:val="center"/>
+                </w:tcPr>
+                <w:p>
+                  <w:pPr>
+                    <w:spacing w:after="0"/>
+                    <w:jc w:val="center"/>
+                  </w:pPr>
+                  <w:r>
+                    <w:rPr>
+                      <w:rFonts w:ascii="Calibri" w:cs="Calibri" w:eastAsia="Calibri" w:hAnsi="Calibri"/>
+                      <w:b/>
+                      <w:bCs/>
+                      <w:color w:val="FFFFFF"/>
+                      <w:sz w:val="30"/>
+                      <w:szCs w:val="30"/>
+                    </w:rPr>
+                    <w:t xml:space="preserve">JS</w:t>
+                  </w:r>
+                </w:p>
+              </w:tc>
+              <w:tc>
+                <w:tcPr>
+                  <w:tcW w:type="dxa" w:w="6126"/>
+                  <w:tcBorders>
+                    <w:top w:val="none" w:color="FFFFFF" w:sz="0"/>
+                    <w:left w:val="none" w:color="FFFFFF" w:sz="0"/>
+                    <w:bottom w:val="none" w:color="FFFFFF" w:sz="0"/>
+                    <w:right w:val="none" w:color="FFFFFF" w:sz="0"/>
+                  </w:tcBorders>
+                  <w:shd w:fill="F8EDEA" w:color="auto" w:val="clear"/>
+                  <w:tcMar>
+                    <w:top w:type="dxa" w:w="110"/>
+                    <w:left w:type="dxa" w:w="200"/>
+                    <w:bottom w:type="dxa" w:w="110"/>
+                    <w:right w:type="dxa" w:w="160"/>
+                  </w:tcMar>
+                </w:tcPr>
+                <w:p>
+                  <w:pPr>
+                    <w:tabs>
+                      <w:tab w:val="right" w:pos="5826"/>
+                    </w:tabs>
+                    <w:spacing w:after="10"/>
+                  </w:pPr>
+                  <w:r>
+                    <w:rPr>
+                      <w:rFonts w:ascii="Calibri" w:cs="Calibri" w:eastAsia="Calibri" w:hAnsi="Calibri"/>
+                      <w:b/>
+                      <w:bCs/>
+                      <w:color w:val="262626"/>
+                      <w:sz w:val="22"/>
+                      <w:szCs w:val="22"/>
+                    </w:rPr>
+                    <w:t xml:space="preserve">Intern</w:t>
+                  </w:r>
+                  <w:r>
+                    <w:tab/>
+                  </w:r>
+                  <w:r>
+                    <w:rPr>
+                      <w:rFonts w:ascii="Calibri" w:cs="Calibri" w:eastAsia="Calibri" w:hAnsi="Calibri"/>
+                      <w:i/>
+                      <w:iCs/>
+                      <w:color w:val="C00000"/>
+                      <w:sz w:val="20"/>
+                      <w:szCs w:val="20"/>
+                    </w:rPr>
+                    <w:t xml:space="preserve">[month]</w:t>
+                  </w:r>
+                  <w:r>
+                    <w:rPr>
+                      <w:rFonts w:ascii="Calibri" w:cs="Calibri" w:eastAsia="Calibri" w:hAnsi="Calibri"/>
+                      <w:color w:val="595959"/>
+                      <w:sz w:val="19"/>
+                      <w:szCs w:val="19"/>
+                    </w:rPr>
+                    <w:t xml:space="preserve"> – </w:t>
+                  </w:r>
+                  <w:r>
+                    <w:rPr>
+                      <w:rFonts w:ascii="Calibri" w:cs="Calibri" w:eastAsia="Calibri" w:hAnsi="Calibri"/>
+                      <w:i/>
+                      <w:iCs/>
+                      <w:color w:val="C00000"/>
+                      <w:sz w:val="20"/>
+                      <w:szCs w:val="20"/>
+                    </w:rPr>
+                    <w:t xml:space="preserve">[month]</w:t>
+                  </w:r>
+                  <w:r>
+                    <w:rPr>
+                      <w:rFonts w:ascii="Calibri" w:cs="Calibri" w:eastAsia="Calibri" w:hAnsi="Calibri"/>
+                      <w:color w:val="595959"/>
+                      <w:sz w:val="19"/>
+                      <w:szCs w:val="19"/>
+                    </w:rPr>
+                    <w:t xml:space="preserve"> 2025</w:t>
+                  </w:r>
+                </w:p>
+                <w:p>
+                  <w:pPr>
+                    <w:spacing w:after="30"/>
+                  </w:pPr>
+                  <w:r>
+                    <w:rPr>
+                      <w:rFonts w:ascii="Calibri" w:cs="Calibri" w:eastAsia="Calibri" w:hAnsi="Calibri"/>
+                      <w:b/>
+                      <w:bCs/>
+                      <w:color w:val="B5462D"/>
+                      <w:sz w:val="20"/>
+                      <w:szCs w:val="20"/>
+                    </w:rPr>
+                    <w:t xml:space="preserve">JS Trade Agency</w:t>
+                  </w:r>
+                  <w:r>
+                    <w:rPr>
+                      <w:rFonts w:ascii="Calibri" w:cs="Calibri" w:eastAsia="Calibri" w:hAnsi="Calibri"/>
+                      <w:color w:val="595959"/>
+                      <w:sz w:val="19"/>
+                      <w:szCs w:val="19"/>
+                    </w:rPr>
+                    <w:t xml:space="preserve">  ·  Castellón, Spain</w:t>
+                  </w:r>
+                </w:p>
+                <w:p>
+                  <w:pPr>
+                    <w:spacing w:after="50" w:line="252"/>
+                  </w:pPr>
+                  <w:r>
+                    <w:rPr>
+                      <w:rFonts w:ascii="Calibri" w:cs="Calibri" w:eastAsia="Calibri" w:hAnsi="Calibri"/>
+                      <w:i/>
+                      <w:iCs/>
+                      <w:color w:val="595959"/>
+                      <w:sz w:val="18"/>
+                      <w:szCs w:val="18"/>
+                    </w:rPr>
+                    <w:t xml:space="preserve">Trade agency for ceramic tiles in Castellón, the heart of the Spanish tile industry.</w:t>
+                  </w:r>
+                </w:p>
+                <w:p>
+                  <w:pPr>
+                    <w:pStyle w:val="ListParagraph"/>
+                    <w:numPr>
+                      <w:ilvl w:val="0"/>
+                      <w:numId w:val="3"/>
+                    </w:numPr>
+                    <w:spacing w:after="30" w:line="252"/>
+                  </w:pPr>
+                  <w:r>
+                    <w:rPr>
+                      <w:rFonts w:ascii="Calibri" w:cs="Calibri" w:eastAsia="Calibri" w:hAnsi="Calibri"/>
+                      <w:color w:val="262626"/>
+                      <w:sz w:val="19"/>
+                      <w:szCs w:val="19"/>
+                    </w:rPr>
+                    <w:t xml:space="preserve">International internship in tile sales and export; supported clients and suppliers and put my Spanish into practice.</w:t>
                   </w:r>
                 </w:p>
               </w:tc>

</xml_diff>